<commit_message>
feat: expand Option 2 with V-MAT-PATH 4-stage AI concept and review notes
Agent-Logs-Url: https://github.com/heinzl75/Project_Ideas-ICME4MC/sessions/0e4652ea-403d-43aa-b6f5-a4c6e4cbbe7f

Co-authored-by: heinzl75 <56819085+heinzl75@users.noreply.github.com>
</commit_message>
<xml_diff>
--- a/ICME4CRASH.docx
+++ b/ICME4CRASH.docx
@@ -4949,106 +4949,416 @@
     </w:p>
     <w:p>
       <w:pPr>
-        <w:numPr>
-          <w:ilvl w:val="0"/>
-          <w:numId w:val="25"/>
-        </w:numPr>
-      </w:pPr>
-      <w:r>
-        <w:rPr>
-          <w:b/>
-          <w:bCs/>
-        </w:rPr>
-        <w:t>Fokus:</w:t>
-      </w:r>
-      <w:r>
-        <w:t xml:space="preserve"> Datengetriebene Korrelation von Schliffbildern zu Materialkarten.</w:t>
-      </w:r>
-    </w:p>
-    <w:p>
-      <w:pPr>
-        <w:numPr>
-          <w:ilvl w:val="0"/>
-          <w:numId w:val="25"/>
-        </w:numPr>
-      </w:pPr>
-      <w:r>
-        <w:rPr>
-          <w:b/>
-          <w:bCs/>
-        </w:rPr>
-        <w:t>Kernargument:</w:t>
-      </w:r>
-      <w:r>
-        <w:t xml:space="preserve"> „Wir nutzen die KI, um das Expertenwissen der Metallographie (LWF) in Sekunden auf das ganze Auto zu übertragen.“</w:t>
-      </w:r>
-    </w:p>
-    <w:p>
-      <w:pPr>
-        <w:numPr>
-          <w:ilvl w:val="0"/>
-          <w:numId w:val="25"/>
-        </w:numPr>
-      </w:pPr>
-      <w:r>
-        <w:rPr>
-          <w:b/>
-          <w:bCs/>
-        </w:rPr>
-        <w:t>Stärke:</w:t>
-      </w:r>
-      <w:r>
-        <w:t xml:space="preserve"> Sehr hohe Bewertung bei „Impact“ und „Exploitation“. Gut für </w:t>
-      </w:r>
-      <w:r>
-        <w:rPr>
-          <w:b/>
-          <w:bCs/>
-        </w:rPr>
-        <w:t>ViF</w:t>
-      </w:r>
-      <w:r>
-        <w:t xml:space="preserve">, </w:t>
-      </w:r>
-      <w:proofErr w:type="spellStart"/>
-      <w:r>
-        <w:rPr>
-          <w:b/>
-          <w:bCs/>
-        </w:rPr>
-        <w:t>MatCalc</w:t>
-      </w:r>
-      <w:proofErr w:type="spellEnd"/>
-      <w:r>
-        <w:t xml:space="preserve"> und die </w:t>
-      </w:r>
-      <w:r>
-        <w:rPr>
-          <w:b/>
-          <w:bCs/>
-        </w:rPr>
-        <w:t>Softwarehäuser (ESI)</w:t>
-      </w:r>
-      <w:r>
-        <w:t>.</w:t>
-      </w:r>
-    </w:p>
-    <w:p>
-      <w:pPr>
-        <w:numPr>
-          <w:ilvl w:val="0"/>
-          <w:numId w:val="25"/>
-        </w:numPr>
-      </w:pPr>
-      <w:r>
-        <w:rPr>
-          <w:b/>
-          <w:bCs/>
-        </w:rPr>
-        <w:t>Passt zu Calls, die:</w:t>
-      </w:r>
-      <w:r>
-        <w:t xml:space="preserve"> Digitalisierung der Industrie, KI in der Produktion oder „Twin Transition“ zum Thema haben.</w:t>
+        <w:pStyle w:val="Normal"/>
+      </w:pPr>
+      <w:r>
+        <w:rPr>
+          <w:b/>
+        </w:rPr>
+        <w:t xml:space="preserve">Fokus:</w:t>
+      </w:r>
+      <w:r>
+        <w:t xml:space="preserve"> Praediktive Verknüpfung von thermokinetischer Prozesssimulation, physischer Validierung und KI-basiertem Property-Mapping.</w:t>
+      </w:r>
+    </w:p>
+    <w:p>
+      <w:pPr>
+        <w:pStyle w:val="Normal"/>
+      </w:pPr>
+      <w:r>
+        <w:rPr>
+          <w:b/>
+        </w:rPr>
+        <w:t xml:space="preserve">Kernargument:</w:t>
+      </w:r>
+      <w:r>
+        <w:t xml:space="preserve"> „Die KI lernt einmalig die Sprache der Mikrostruktur – danach übersetzt sie jede neue thermische Geschichte sofort in eine einsetzbare Materialkarte.“</w:t>
+      </w:r>
+    </w:p>
+    <w:p>
+      <w:pPr>
+        <w:pStyle w:val="Normal"/>
+      </w:pPr>
+    </w:p>
+    <w:p>
+      <w:pPr>
+        <w:pStyle w:val="Normal"/>
+      </w:pPr>
+      <w:r>
+        <w:t xml:space="preserve">─── V-MAT-PATH: Virtual Material Path Calibration ───</w:t>
+      </w:r>
+    </w:p>
+    <w:p>
+      <w:pPr>
+        <w:pStyle w:val="Normal"/>
+      </w:pPr>
+    </w:p>
+    <w:p>
+      <w:pPr>
+        <w:pStyle w:val="Normal"/>
+      </w:pPr>
+      <w:r>
+        <w:rPr>
+          <w:b/>
+        </w:rPr>
+        <w:t xml:space="preserve">Ziel:</w:t>
+      </w:r>
+      <w:r>
+        <w:t xml:space="preserve"> Schaffung einer praediktiven Toolkette, die die mechanische Performance eines Bauteils direkt aus seiner thermischen Historie vorhersagt – ohne für jede Prozessvariation neue Versuche fahren zu müssen.</w:t>
+      </w:r>
+    </w:p>
+    <w:p>
+      <w:pPr>
+        <w:pStyle w:val="Normal"/>
+      </w:pPr>
+    </w:p>
+    <w:p>
+      <w:pPr>
+        <w:pStyle w:val="Normal"/>
+      </w:pPr>
+      <w:r>
+        <w:t xml:space="preserve">Stufe 1 – Definition der thermischen Fingerabdrücke</w:t>
+      </w:r>
+    </w:p>
+    <w:p>
+      <w:pPr>
+        <w:pStyle w:val="Normal"/>
+      </w:pPr>
+      <w:r>
+        <w:t xml:space="preserve">Für die gewählten Werkstoffe (z. B. 22MnB5 fürs Presshärten, DP1000 für den Leichtbau) werden charakteristische Temperatur-Zeit-Verläufe T(t) definiert.</w:t>
+      </w:r>
+    </w:p>
+    <w:p>
+      <w:pPr>
+        <w:pStyle w:val="Normal"/>
+      </w:pPr>
+      <w:r>
+        <w:rPr>
+          <w:b/>
+        </w:rPr>
+        <w:t xml:space="preserve">Prozess-Relevanz:</w:t>
+      </w:r>
+      <w:r>
+        <w:t xml:space="preserve"> Die Zyklen bilden reale Fertigungsschritte ab: Aufheizen, Haltezeiten, unterschiedliche Abkühlraten (Werkzeugkontakt vs. Luft) sowie Schweißzyklen (extrem schnelle Zyklen in der Wärmeeinflusszone).</w:t>
+      </w:r>
+    </w:p>
+    <w:p>
+      <w:pPr>
+        <w:pStyle w:val="Normal"/>
+      </w:pPr>
+      <w:r>
+        <w:rPr>
+          <w:b/>
+        </w:rPr>
+        <w:t xml:space="preserve">Simulation (MatCalc/Thermo-Calc):</w:t>
+      </w:r>
+      <w:r>
+        <w:t xml:space="preserve"> Diese Tools berechnen die Gefügegenese entlang dieser Pfade. Output sind quantitative Parameter: Anteile von Martensit, Bainit, Ferrit, Karbidausscheidungen und Korngrößenentwicklung.</w:t>
+      </w:r>
+    </w:p>
+    <w:p>
+      <w:pPr>
+        <w:pStyle w:val="Normal"/>
+      </w:pPr>
+    </w:p>
+    <w:p>
+      <w:pPr>
+        <w:pStyle w:val="Normal"/>
+      </w:pPr>
+      <w:r>
+        <w:t xml:space="preserve">Stufe 2 – Der experimentelle Anker (Physische Validierung)</w:t>
+      </w:r>
+    </w:p>
+    <w:p>
+      <w:pPr>
+        <w:pStyle w:val="Normal"/>
+      </w:pPr>
+      <w:r>
+        <w:t xml:space="preserve">Parallel zur Simulation werden reale Proben exakt denselben Zyklen unterzogen (z. B. Gleeble-Anlage, Dilatometer).</w:t>
+      </w:r>
+    </w:p>
+    <w:p>
+      <w:pPr>
+        <w:pStyle w:val="Normal"/>
+      </w:pPr>
+      <w:r>
+        <w:rPr>
+          <w:b/>
+        </w:rPr>
+        <w:t xml:space="preserve">Metallographie:</w:t>
+      </w:r>
+      <w:r>
+        <w:t xml:space="preserve"> Schliffbilder dienen als „Ground Truth“, um die MatCalc-Simulation zu kalibrieren (Abgleich berechneter Phasenanteile und Korngrößen mit dem realen Gefügebild).</w:t>
+      </w:r>
+    </w:p>
+    <w:p>
+      <w:pPr>
+        <w:pStyle w:val="Normal"/>
+      </w:pPr>
+      <w:r>
+        <w:rPr>
+          <w:b/>
+        </w:rPr>
+        <w:t xml:space="preserve">Materialcharakterisierung:</w:t>
+      </w:r>
+      <w:r>
+        <w:t xml:space="preserve"> Die thermisch konditionierten Proben werden mechanisch geprüft (Zugversuch, Kerbschlagbiegeversuch). Ziel ist die Ermittlung der Materialkartenparameter (Fließkurven-Koeffizienten, Versagensparameter wie GISSMO oder Johnson-Cook).</w:t>
+      </w:r>
+    </w:p>
+    <w:p>
+      <w:pPr>
+        <w:pStyle w:val="Normal"/>
+      </w:pPr>
+    </w:p>
+    <w:p>
+      <w:pPr>
+        <w:pStyle w:val="Normal"/>
+      </w:pPr>
+      <w:r>
+        <w:t xml:space="preserve">Stufe 3 – Das KI-Mapping (Property Predictor)</w:t>
+      </w:r>
+    </w:p>
+    <w:p>
+      <w:pPr>
+        <w:pStyle w:val="Normal"/>
+      </w:pPr>
+      <w:r>
+        <w:t xml:space="preserve">Herzstück des Ansatzes: Eine KI (Random Forest oder Neuronales Netz) fungiert als „Übersetzer“ zwischen Mikrostruktur und Makro-Performance.</w:t>
+      </w:r>
+    </w:p>
+    <w:p>
+      <w:pPr>
+        <w:pStyle w:val="Normal"/>
+      </w:pPr>
+      <w:r>
+        <w:rPr>
+          <w:b/>
+        </w:rPr>
+        <w:t xml:space="preserve">Input (X):</w:t>
+      </w:r>
+      <w:r>
+        <w:t xml:space="preserve"> Von MatCalc/Thermo-Calc gelieferte (und validierte) Gefügeparameter, z. B. 80 % Martensit, 20 % Bainit, Korngröße 10 µm, Ausscheidungsdichte.</w:t>
+      </w:r>
+    </w:p>
+    <w:p>
+      <w:pPr>
+        <w:pStyle w:val="Normal"/>
+      </w:pPr>
+      <w:r>
+        <w:rPr>
+          <w:b/>
+        </w:rPr>
+        <w:t xml:space="preserve">Output (Y):</w:t>
+      </w:r>
+      <w:r>
+        <w:t xml:space="preserve"> Experimentell ermittelte Parameter der Materialkarte, z. B. Verfestigungskoeffizient A, Exponent n, Bruchdehnung εf.</w:t>
+      </w:r>
+    </w:p>
+    <w:p>
+      <w:pPr>
+        <w:pStyle w:val="Normal"/>
+      </w:pPr>
+      <w:r>
+        <w:rPr>
+          <w:b/>
+        </w:rPr>
+        <w:t xml:space="preserve">Lerneffekt:</w:t>
+      </w:r>
+      <w:r>
+        <w:t xml:space="preserve"> Die KI erlernt die oft hochgradig nicht-linearen Abhängigkeiten zwischen Mikrostruktur und Makro-Performance, die mit analytischen Gleichungen nicht abbildbar sind.</w:t>
+      </w:r>
+    </w:p>
+    <w:p>
+      <w:pPr>
+        <w:pStyle w:val="Normal"/>
+      </w:pPr>
+    </w:p>
+    <w:p>
+      <w:pPr>
+        <w:pStyle w:val="Normal"/>
+      </w:pPr>
+      <w:r>
+        <w:t xml:space="preserve">Stufe 4 – Virtuelle Anwendung &amp; Prädiktion</w:t>
+      </w:r>
+    </w:p>
+    <w:p>
+      <w:pPr>
+        <w:pStyle w:val="Normal"/>
+      </w:pPr>
+      <w:r>
+        <w:t xml:space="preserve">Ist die KI einmal trainiert, kann die Toolkette für vollständig neue, rein virtuell definierte Szenarien genutzt werden:</w:t>
+      </w:r>
+    </w:p>
+    <w:p>
+      <w:pPr>
+        <w:pStyle w:val="Normal"/>
+      </w:pPr>
+      <w:r>
+        <w:rPr>
+          <w:b/>
+        </w:rPr>
+        <w:t xml:space="preserve">Neuer Prozessschritt:</w:t>
+      </w:r>
+      <w:r>
+        <w:t xml:space="preserve"> Ein Ingenieur ändert den Schweißprozess oder die Werkzeugkühlung.</w:t>
+      </w:r>
+    </w:p>
+    <w:p>
+      <w:pPr>
+        <w:pStyle w:val="Normal"/>
+      </w:pPr>
+      <w:r>
+        <w:rPr>
+          <w:b/>
+        </w:rPr>
+        <w:t xml:space="preserve">Virtuelle Kinetik:</w:t>
+      </w:r>
+      <w:r>
+        <w:t xml:space="preserve"> MatCalc berechnet das resultierende Gefüge für diesen neuen thermischen Pfad.</w:t>
+      </w:r>
+    </w:p>
+    <w:p>
+      <w:pPr>
+        <w:pStyle w:val="Normal"/>
+      </w:pPr>
+      <w:r>
+        <w:rPr>
+          <w:b/>
+        </w:rPr>
+        <w:t xml:space="preserve">KI-Vorhersage:</w:t>
+      </w:r>
+      <w:r>
+        <w:t xml:space="preserve"> Die KI nimmt die neuen Gefügeparameter und erzeugt sofort die zugehörige Materialkarte.</w:t>
+      </w:r>
+    </w:p>
+    <w:p>
+      <w:pPr>
+        <w:pStyle w:val="Normal"/>
+      </w:pPr>
+      <w:r>
+        <w:rPr>
+          <w:b/>
+        </w:rPr>
+        <w:t xml:space="preserve">Crash-Simulation:</w:t>
+      </w:r>
+      <w:r>
+        <w:t xml:space="preserve"> Der OEM (z. B. Audi, Volvo) nutzt die neue Karte direkt in der LS-DYNA-Gesamtfahrzeugsimulation – ohne eine einzige physische Probe hergestellt zu haben.</w:t>
+      </w:r>
+    </w:p>
+    <w:p>
+      <w:pPr>
+        <w:pStyle w:val="Normal"/>
+      </w:pPr>
+    </w:p>
+    <w:p>
+      <w:pPr>
+        <w:pStyle w:val="Normal"/>
+      </w:pPr>
+      <w:r>
+        <w:rPr>
+          <w:b/>
+        </w:rPr>
+        <w:t xml:space="preserve">Stärke:</w:t>
+      </w:r>
+      <w:r>
+        <w:t xml:space="preserve"> Sehr hohe Bewertung bei „Impact“ und „Exploitation“. Idealer Fit für ViF (KI-Pipeline), MatCalc (Simulation) und ESI (LS-DYNA-Integration).</w:t>
+      </w:r>
+    </w:p>
+    <w:p>
+      <w:pPr>
+        <w:pStyle w:val="Normal"/>
+      </w:pPr>
+      <w:r>
+        <w:rPr>
+          <w:b/>
+        </w:rPr>
+        <w:t xml:space="preserve">Passt zu Calls:</w:t>
+      </w:r>
+      <w:r>
+        <w:t xml:space="preserve"> Digitalisierung der Industrie, KI in der Produktion, „Twin Transition“, Horizon-EIC-Accelerator (TRL 4→6).</w:t>
+      </w:r>
+    </w:p>
+    <w:p>
+      <w:pPr>
+        <w:pStyle w:val="Normal"/>
+      </w:pPr>
+    </w:p>
+    <w:p>
+      <w:pPr>
+        <w:pStyle w:val="Normal"/>
+      </w:pPr>
+      <w:r>
+        <w:t xml:space="preserve">── Review-Anmerkungen ──</w:t>
+      </w:r>
+    </w:p>
+    <w:p>
+      <w:pPr>
+        <w:pStyle w:val="Normal"/>
+      </w:pPr>
+      <w:r>
+        <w:rPr>
+          <w:b/>
+        </w:rPr>
+        <w:t xml:space="preserve">Stärken:</w:t>
+      </w:r>
+      <w:r>
+        <w:t xml:space="preserve"> Das V-MAT-PATH-Konzept ist klar strukturiert und schließt eine reale Lücke: die prozessbedingte Degradierung von Materialeigenschaften in der HAZ und bei Presshärtebauteilen. Die 4-stufige Kaskade (Simulation → Experiment → KI → Vorhersage) ist nachvollziehbar und gut auf das vorhandene Konsortium (MatCalc, LWF, MCL, ViF) abgestimmt.</w:t>
+      </w:r>
+    </w:p>
+    <w:p>
+      <w:pPr>
+        <w:pStyle w:val="Normal"/>
+      </w:pPr>
+      <w:r>
+        <w:rPr>
+          <w:b/>
+        </w:rPr>
+        <w:t xml:space="preserve">Handlungsbedarf – Datenbasis:</w:t>
+      </w:r>
+      <w:r>
+        <w:t xml:space="preserve"> Der KI-Ansatz steht und fällt mit der Größe und Diversität des Trainingsdatensatzes. Für Random Forest / NN sind realistische Datenmengen (&gt;200 Datenpunkte je Materialklasse) notwendig. Empfehlung: bereits im Proposal einen konkreten Datenplan (Anzahl Zyklen × Materialien × Chargen) ausweisen.</w:t>
+      </w:r>
+    </w:p>
+    <w:p>
+      <w:pPr>
+        <w:pStyle w:val="Normal"/>
+      </w:pPr>
+      <w:r>
+        <w:rPr>
+          <w:b/>
+        </w:rPr>
+        <w:t xml:space="preserve">Handlungsbedarf – Extrapolation:</w:t>
+      </w:r>
+      <w:r>
+        <w:t xml:space="preserve"> KI-Modelle extrapolieren schlecht außerhalb des Trainingsraums. Das Konzept sollte Physics-Informed Constraints oder Gaussian-Process-Regression als robustere Alternative zu reinen Black-Box-Netzen evaluieren (passt zu SO3 im Dokument).</w:t>
+      </w:r>
+    </w:p>
+    <w:p>
+      <w:pPr>
+        <w:pStyle w:val="Normal"/>
+      </w:pPr>
+      <w:r>
+        <w:rPr>
+          <w:b/>
+        </w:rPr>
+        <w:t xml:space="preserve">Handlungsbedarf – Validierungsstrategie:</w:t>
+      </w:r>
+      <w:r>
+        <w:t xml:space="preserve"> Stufe 2 (experimenteller Anker) muss quantitativ schärfer gefasst werden: Wie viele Ankerversuche pro Werkstoff? Welches Konfidenzniveau ist akzeptiert? Dies ist kritisch für die OEM-Akzeptanz (TO3).</w:t>
+      </w:r>
+    </w:p>
+    <w:p>
+      <w:pPr>
+        <w:pStyle w:val="Normal"/>
+      </w:pPr>
+      <w:r>
+        <w:rPr>
+          <w:b/>
+        </w:rPr>
+        <w:t xml:space="preserve">Synergien:</w:t>
+      </w:r>
+      <w:r>
+        <w:t xml:space="preserve"> V-MAT-PATH ist ein direktes Bindeglied zwischen WP 4 (Physik/ICME) und WP 5 (KI-Homogenisierung). Eine explizite Aufnahme in den WP-5-Scope stärkt die Konsistenz des Proposals.</w:t>
       </w:r>
     </w:p>
     <w:p>

</xml_diff>